<commit_message>
feat: enhance DOCX equation recovery by supporting WMF images and improving OLE handling
</commit_message>
<xml_diff>
--- a/tests/snapshot_cases_convert/comprehensive/comprehensive.docx
+++ b/tests/snapshot_cases_convert/comprehensive/comprehensive.docx
@@ -121,10 +121,10 @@
             <v:path o:extrusionok="f" gradientshapeok="t" o:connecttype="rect"/>
             <o:lock v:ext="edit" aspectratio="t"/>
           </v:shapetype>
-          <v:shape id="_x0000_i1025" type="#_x0000_t75" style="width:53.15pt;height:20.15pt" o:ole="">
+          <v:shape id="_x0000_i1025" type="#_x0000_t75" style="width:53.05pt;height:20.35pt" o:ole="">
             <v:imagedata r:id="rId8" o:title=""/>
           </v:shape>
-          <o:OLEObject Type="Embed" ProgID="Equation.DSMT4" ShapeID="_x0000_i1025" DrawAspect="Content" ObjectID="_1852666908" r:id="rId9"/>
+          <o:OLEObject Type="Embed" ProgID="Equation.DSMT4" ShapeID="_x0000_i1025" DrawAspect="Content" ObjectID="_1852829117" r:id="rId9"/>
         </w:object>
       </w:r>
     </w:p>
@@ -140,10 +140,10 @@
           <w:position w:val="-8"/>
         </w:rPr>
         <w:object w:dxaOrig="920" w:dyaOrig="400" w14:anchorId="3EC645E3">
-          <v:shape id="_x0000_i1026" type="#_x0000_t75" style="width:45.85pt;height:20.15pt" o:ole="">
+          <v:shape id="_x0000_i1026" type="#_x0000_t75" style="width:45.95pt;height:20.35pt" o:ole="">
             <v:imagedata r:id="rId10" o:title=""/>
           </v:shape>
-          <o:OLEObject Type="Embed" ProgID="Equation.DSMT4" ShapeID="_x0000_i1026" DrawAspect="Content" ObjectID="_1852666909" r:id="rId11"/>
+          <o:OLEObject Type="Embed" ProgID="Equation.DSMT4" ShapeID="_x0000_i1026" DrawAspect="Content" ObjectID="_1852829118" r:id="rId11"/>
         </w:object>
       </w:r>
     </w:p>
@@ -167,10 +167,10 @@
           <w:position w:val="-20"/>
         </w:rPr>
         <w:object w:dxaOrig="400" w:dyaOrig="440" w14:anchorId="7F7CD593">
-          <v:shape id="_x0000_i1027" type="#_x0000_t75" style="width:20.15pt;height:21.85pt" o:ole="">
+          <v:shape id="_x0000_i1027" type="#_x0000_t75" style="width:20.35pt;height:21.8pt" o:ole="">
             <v:imagedata r:id="rId12" o:title=""/>
           </v:shape>
-          <o:OLEObject Type="Embed" ProgID="Equation.DSMT4" ShapeID="_x0000_i1027" DrawAspect="Content" ObjectID="_1852666910" r:id="rId13"/>
+          <o:OLEObject Type="Embed" ProgID="Equation.DSMT4" ShapeID="_x0000_i1027" DrawAspect="Content" ObjectID="_1852829119" r:id="rId13"/>
         </w:object>
       </w:r>
       <w:r>
@@ -259,10 +259,10 @@
                 <w:position w:val="-8"/>
               </w:rPr>
               <w:object w:dxaOrig="1060" w:dyaOrig="400" w14:anchorId="3B3EB920">
-                <v:shape id="_x0000_i1028" type="#_x0000_t75" style="width:53.15pt;height:20.15pt" o:ole="">
+                <v:shape id="_x0000_i1028" type="#_x0000_t75" style="width:53.05pt;height:20.35pt" o:ole="">
                   <v:imagedata r:id="rId8" o:title=""/>
                 </v:shape>
-                <o:OLEObject Type="Embed" ProgID="Equation.DSMT4" ShapeID="_x0000_i1028" DrawAspect="Content" ObjectID="_1852666911" r:id="rId14"/>
+                <o:OLEObject Type="Embed" ProgID="Equation.DSMT4" ShapeID="_x0000_i1028" DrawAspect="Content" ObjectID="_1852829120" r:id="rId14"/>
               </w:object>
             </w:r>
           </w:p>
@@ -976,10 +976,10 @@
                 <w:position w:val="-8"/>
               </w:rPr>
               <w:object w:dxaOrig="1060" w:dyaOrig="400" w14:anchorId="6E080566">
-                <v:shape id="_x0000_i1029" type="#_x0000_t75" style="width:53.15pt;height:20.15pt" o:ole="">
+                <v:shape id="_x0000_i1029" type="#_x0000_t75" style="width:53.05pt;height:20.35pt" o:ole="">
                   <v:imagedata r:id="rId8" o:title=""/>
                 </v:shape>
-                <o:OLEObject Type="Embed" ProgID="Equation.DSMT4" ShapeID="_x0000_i1029" DrawAspect="Content" ObjectID="_1852666912" r:id="rId18"/>
+                <o:OLEObject Type="Embed" ProgID="Equation.DSMT4" ShapeID="_x0000_i1029" DrawAspect="Content" ObjectID="_1852829121" r:id="rId18"/>
               </w:object>
             </w:r>
           </w:p>
@@ -1031,10 +1031,10 @@
                 <w:position w:val="-8"/>
               </w:rPr>
               <w:object w:dxaOrig="1060" w:dyaOrig="400" w14:anchorId="6E080566">
-                <v:shape id="_x0000_i1030" type="#_x0000_t75" style="width:53.15pt;height:20.15pt" o:ole="">
+                <v:shape id="_x0000_i1030" type="#_x0000_t75" style="width:53.05pt;height:20.35pt" o:ole="">
                   <v:imagedata r:id="rId8" o:title=""/>
                 </v:shape>
-                <o:OLEObject Type="Embed" ProgID="Equation.DSMT4" ShapeID="_x0000_i1030" DrawAspect="Content" ObjectID="_1852666913" r:id="rId19"/>
+                <o:OLEObject Type="Embed" ProgID="Equation.DSMT4" ShapeID="_x0000_i1030" DrawAspect="Content" ObjectID="_1852829122" r:id="rId19"/>
               </w:object>
             </w:r>
           </w:p>
@@ -1077,10 +1077,10 @@
                 <w:position w:val="-8"/>
               </w:rPr>
               <w:object w:dxaOrig="1060" w:dyaOrig="400" w14:anchorId="6E080566">
-                <v:shape id="_x0000_i1031" type="#_x0000_t75" style="width:53.15pt;height:20.15pt" o:ole="">
+                <v:shape id="_x0000_i1031" type="#_x0000_t75" style="width:53.05pt;height:20.35pt" o:ole="">
                   <v:imagedata r:id="rId8" o:title=""/>
                 </v:shape>
-                <o:OLEObject Type="Embed" ProgID="Equation.DSMT4" ShapeID="_x0000_i1031" DrawAspect="Content" ObjectID="_1852666914" r:id="rId20"/>
+                <o:OLEObject Type="Embed" ProgID="Equation.DSMT4" ShapeID="_x0000_i1031" DrawAspect="Content" ObjectID="_1852829123" r:id="rId20"/>
               </w:object>
             </w:r>
           </w:p>
@@ -1136,10 +1136,10 @@
                 <w:position w:val="-8"/>
               </w:rPr>
               <w:object w:dxaOrig="1060" w:dyaOrig="400" w14:anchorId="6E080566">
-                <v:shape id="_x0000_i1032" type="#_x0000_t75" style="width:53.15pt;height:20.15pt" o:ole="">
+                <v:shape id="_x0000_i1032" type="#_x0000_t75" style="width:53.05pt;height:20.35pt" o:ole="">
                   <v:imagedata r:id="rId8" o:title=""/>
                 </v:shape>
-                <o:OLEObject Type="Embed" ProgID="Equation.DSMT4" ShapeID="_x0000_i1032" DrawAspect="Content" ObjectID="_1852666915" r:id="rId21"/>
+                <o:OLEObject Type="Embed" ProgID="Equation.DSMT4" ShapeID="_x0000_i1032" DrawAspect="Content" ObjectID="_1852829124" r:id="rId21"/>
               </w:object>
             </w:r>
           </w:p>
@@ -1182,10 +1182,10 @@
                 <w:position w:val="-8"/>
               </w:rPr>
               <w:object w:dxaOrig="1060" w:dyaOrig="400" w14:anchorId="6E080566">
-                <v:shape id="_x0000_i1033" type="#_x0000_t75" style="width:53.15pt;height:20.15pt" o:ole="">
+                <v:shape id="_x0000_i1033" type="#_x0000_t75" style="width:53.05pt;height:20.35pt" o:ole="">
                   <v:imagedata r:id="rId8" o:title=""/>
                 </v:shape>
-                <o:OLEObject Type="Embed" ProgID="Equation.DSMT4" ShapeID="_x0000_i1033" DrawAspect="Content" ObjectID="_1852666916" r:id="rId22"/>
+                <o:OLEObject Type="Embed" ProgID="Equation.DSMT4" ShapeID="_x0000_i1033" DrawAspect="Content" ObjectID="_1852829125" r:id="rId22"/>
               </w:object>
             </w:r>
           </w:p>
@@ -1603,9 +1603,9 @@
             <o:lock v:ext="edit" aspectratio="t"/>
           </v:shapetype>
           <v:shape id="_x0000_i2001" type="#_x0000_t75" style="width:53.15pt;height:20.25pt" o:ole="">
-            <v:imagedata r:id="rIdConvert2001Preview" o:title=""/>
+            <v:imagedata r:id="rIdRestored0_0_rIdConvert2001Preview" o:title=""/>
           </v:shape>
-          <o:OLEObject Type="Embed" ProgID="Equation.DSMT4" ShapeID="_x0000_i2001" DrawAspect="Content" ObjectID="_1900002001" r:id="rIdConvertBadOle"/>
+          <o:OLEObject Type="Embed" ProgID="Equation.DSMT4" ShapeID="_x0000_i2001" DrawAspect="Content" ObjectID="_1900002001" r:id="rIdRestored0_0_rIdConvertBadOle"/>
         </w:object>
       </w:r>
     </w:p>
@@ -1621,9 +1621,9 @@
         </w:rPr>
         <w:object w:dxaOrig="1060" w:dyaOrig="400" w14:anchorId="6E080566">
           <v:shape id="_x0000_i1035" type="#_x0000_t75" style="width:53.15pt;height:20.15pt" o:ole="">
-            <v:imagedata r:id="rIdConvert2002Preview" o:title=""/>
+            <v:imagedata r:id="rIdRestored1_0_rIdConvert2002Preview" o:title=""/>
           </v:shape>
-          <o:OLEObject Type="Embed" ProgID="Equation.DSMT4" ShapeID="_x0000_i1035" DrawAspect="Content" ObjectID="_1852666917" r:id="rId23"/>
+          <o:OLEObject Type="Embed" ProgID="Equation.DSMT4" ShapeID="_x0000_i1035" DrawAspect="Content" ObjectID="_1852666917" r:id="rIdRestored1_0_rId23"/>
         </w:object>
       </w:r>
     </w:p>
@@ -1631,7 +1631,7 @@
       <w:r>
         <w:pict w14:anchorId="25FD55FD">
           <v:shape id="_x0000_i1036" type="#_x0000_t75" style="width:53.15pt;height:20.15pt">
-            <v:imagedata r:id="rIdConvert2002Preview" o:title=""/>
+            <v:imagedata r:id="rIdRestored1_1_rIdConvert2002Preview" o:title=""/>
           </v:shape>
         </w:pict>
       </w:r>
@@ -1656,9 +1656,9 @@
         </w:rPr>
         <w:object w:dxaOrig="1060" w:dyaOrig="400" w14:anchorId="6E080566">
           <v:shape id="_x0000_i1037" type="#_x0000_t75" style="width:53.15pt;height:20.15pt" o:ole="">
-            <v:imagedata r:id="rIdConvert2003Preview" o:title=""/>
+            <v:imagedata r:id="rIdRestored2_0_rIdConvert2003Preview" o:title=""/>
           </v:shape>
-          <o:OLEObject Type="Embed" ProgID="Package" ShapeID="_x0000_i1037" DrawAspect="Content" ObjectID="_1852666918" r:id="rId24"/>
+          <o:OLEObject Type="Embed" ProgID="Package" ShapeID="_x0000_i1037" DrawAspect="Content" ObjectID="_1852666918" r:id="rIdRestored2_0_rId24"/>
         </w:object>
       </w:r>
     </w:p>
@@ -1677,6 +1677,410 @@
       <w:r>
         <w:footnoteReference w:id="1"/>
       </w:r>
+    </w:p>
+    <w:p/>
+    <w:p>
+      <w:pPr>
+        <w:pStyle w:val="1"/>
+      </w:pPr>
+      <w:r>
+        <w:rPr>
+          <w:rFonts w:hint="eastAsia"/>
+        </w:rPr>
+        <w:t>仅有</w:t>
+      </w:r>
+      <w:r>
+        <w:rPr>
+          <w:rFonts w:hint="eastAsia"/>
+        </w:rPr>
+        <w:t>WMF</w:t>
+      </w:r>
+      <w:r>
+        <w:rPr>
+          <w:rFonts w:hint="eastAsia"/>
+        </w:rPr>
+        <w:t>的公式</w:t>
+      </w:r>
+    </w:p>
+    <w:p>
+      <w:r>
+        <w:t>在本节中，</w:t>
+      </w:r>
+      <w:r>
+        <w:rPr>
+          <w:noProof/>
+        </w:rPr>
+        <w:drawing>
+          <wp:inline distT="0" distB="0" distL="0" distR="0" wp14:anchorId="6199D524" wp14:editId="6592A11D">
+            <wp:extent cx="180975" cy="180975"/>
+            <wp:effectExtent l="0" t="0" r="0" b="0"/>
+            <wp:docPr id="593" name="图片 593"/>
+            <wp:cNvGraphicFramePr>
+              <a:graphicFrameLocks xmlns:a="http://schemas.openxmlformats.org/drawingml/2006/main" noChangeAspect="1"/>
+            </wp:cNvGraphicFramePr>
+            <a:graphic xmlns:a="http://schemas.openxmlformats.org/drawingml/2006/main">
+              <a:graphicData uri="http://schemas.openxmlformats.org/drawingml/2006/picture">
+                <pic:pic xmlns:pic="http://schemas.openxmlformats.org/drawingml/2006/picture">
+                  <pic:nvPicPr>
+                    <pic:cNvPr id="0" name="Picture 593"/>
+                    <pic:cNvPicPr>
+                      <a:picLocks noChangeAspect="1" noChangeArrowheads="1"/>
+                    </pic:cNvPicPr>
+                  </pic:nvPicPr>
+                  <pic:blipFill>
+                    <a:blip r:embed="rId28" cstate="print">
+                      <a:extLst>
+                        <a:ext uri="{28A0092B-C50C-407E-A947-70E740481C1C}">
+                          <a14:useLocalDpi xmlns:a14="http://schemas.microsoft.com/office/drawing/2010/main" val="0"/>
+                        </a:ext>
+                      </a:extLst>
+                    </a:blip>
+                    <a:srcRect/>
+                    <a:stretch>
+                      <a:fillRect/>
+                    </a:stretch>
+                  </pic:blipFill>
+                  <pic:spPr bwMode="auto">
+                    <a:xfrm>
+                      <a:off x="0" y="0"/>
+                      <a:ext cx="180975" cy="180975"/>
+                    </a:xfrm>
+                    <a:prstGeom prst="rect">
+                      <a:avLst/>
+                    </a:prstGeom>
+                    <a:noFill/>
+                    <a:ln>
+                      <a:noFill/>
+                    </a:ln>
+                  </pic:spPr>
+                </pic:pic>
+              </a:graphicData>
+            </a:graphic>
+          </wp:inline>
+        </w:drawing>
+      </w:r>
+      <w:r>
+        <w:t>表示预测得到的节点温度</w:t>
+      </w:r>
+      <w:r>
+        <w:rPr>
+          <w:noProof/>
+        </w:rPr>
+        <w:drawing>
+          <wp:inline distT="0" distB="0" distL="0" distR="0" wp14:anchorId="453BC9F9" wp14:editId="21C039A3">
+            <wp:extent cx="180975" cy="180975"/>
+            <wp:effectExtent l="0" t="0" r="0" b="0"/>
+            <wp:docPr id="594" name="图片 594"/>
+            <wp:cNvGraphicFramePr>
+              <a:graphicFrameLocks xmlns:a="http://schemas.openxmlformats.org/drawingml/2006/main" noChangeAspect="1"/>
+            </wp:cNvGraphicFramePr>
+            <a:graphic xmlns:a="http://schemas.openxmlformats.org/drawingml/2006/main">
+              <a:graphicData uri="http://schemas.openxmlformats.org/drawingml/2006/picture">
+                <pic:pic xmlns:pic="http://schemas.openxmlformats.org/drawingml/2006/picture">
+                  <pic:nvPicPr>
+                    <pic:cNvPr id="0" name="Picture 594"/>
+                    <pic:cNvPicPr>
+                      <a:picLocks noChangeAspect="1" noChangeArrowheads="1"/>
+                    </pic:cNvPicPr>
+                  </pic:nvPicPr>
+                  <pic:blipFill>
+                    <a:blip r:embed="rId29" cstate="print">
+                      <a:extLst>
+                        <a:ext uri="{28A0092B-C50C-407E-A947-70E740481C1C}">
+                          <a14:useLocalDpi xmlns:a14="http://schemas.microsoft.com/office/drawing/2010/main" val="0"/>
+                        </a:ext>
+                      </a:extLst>
+                    </a:blip>
+                    <a:srcRect/>
+                    <a:stretch>
+                      <a:fillRect/>
+                    </a:stretch>
+                  </pic:blipFill>
+                  <pic:spPr bwMode="auto">
+                    <a:xfrm>
+                      <a:off x="0" y="0"/>
+                      <a:ext cx="180975" cy="180975"/>
+                    </a:xfrm>
+                    <a:prstGeom prst="rect">
+                      <a:avLst/>
+                    </a:prstGeom>
+                    <a:noFill/>
+                    <a:ln>
+                      <a:noFill/>
+                    </a:ln>
+                  </pic:spPr>
+                </pic:pic>
+              </a:graphicData>
+            </a:graphic>
+          </wp:inline>
+        </w:drawing>
+      </w:r>
+      <w:r>
+        <w:t>、应力</w:t>
+      </w:r>
+      <w:r>
+        <w:rPr>
+          <w:noProof/>
+        </w:rPr>
+        <w:drawing>
+          <wp:inline distT="0" distB="0" distL="0" distR="0" wp14:anchorId="666FF66F" wp14:editId="704DE074">
+            <wp:extent cx="180975" cy="180975"/>
+            <wp:effectExtent l="0" t="0" r="0" b="0"/>
+            <wp:docPr id="595" name="图片 595"/>
+            <wp:cNvGraphicFramePr>
+              <a:graphicFrameLocks xmlns:a="http://schemas.openxmlformats.org/drawingml/2006/main" noChangeAspect="1"/>
+            </wp:cNvGraphicFramePr>
+            <a:graphic xmlns:a="http://schemas.openxmlformats.org/drawingml/2006/main">
+              <a:graphicData uri="http://schemas.openxmlformats.org/drawingml/2006/picture">
+                <pic:pic xmlns:pic="http://schemas.openxmlformats.org/drawingml/2006/picture">
+                  <pic:nvPicPr>
+                    <pic:cNvPr id="0" name="Picture 595"/>
+                    <pic:cNvPicPr>
+                      <a:picLocks noChangeAspect="1" noChangeArrowheads="1"/>
+                    </pic:cNvPicPr>
+                  </pic:nvPicPr>
+                  <pic:blipFill>
+                    <a:blip r:embed="rId30" cstate="print">
+                      <a:extLst>
+                        <a:ext uri="{28A0092B-C50C-407E-A947-70E740481C1C}">
+                          <a14:useLocalDpi xmlns:a14="http://schemas.microsoft.com/office/drawing/2010/main" val="0"/>
+                        </a:ext>
+                      </a:extLst>
+                    </a:blip>
+                    <a:srcRect/>
+                    <a:stretch>
+                      <a:fillRect/>
+                    </a:stretch>
+                  </pic:blipFill>
+                  <pic:spPr bwMode="auto">
+                    <a:xfrm>
+                      <a:off x="0" y="0"/>
+                      <a:ext cx="180975" cy="180975"/>
+                    </a:xfrm>
+                    <a:prstGeom prst="rect">
+                      <a:avLst/>
+                    </a:prstGeom>
+                    <a:noFill/>
+                    <a:ln>
+                      <a:noFill/>
+                    </a:ln>
+                  </pic:spPr>
+                </pic:pic>
+              </a:graphicData>
+            </a:graphic>
+          </wp:inline>
+        </w:drawing>
+      </w:r>
+      <w:r>
+        <w:t>或位移</w:t>
+      </w:r>
+      <w:r>
+        <w:rPr>
+          <w:noProof/>
+        </w:rPr>
+        <w:drawing>
+          <wp:inline distT="0" distB="0" distL="0" distR="0" wp14:anchorId="76A8C410" wp14:editId="437698D1">
+            <wp:extent cx="180975" cy="180975"/>
+            <wp:effectExtent l="0" t="0" r="0" b="0"/>
+            <wp:docPr id="596" name="图片 596"/>
+            <wp:cNvGraphicFramePr>
+              <a:graphicFrameLocks xmlns:a="http://schemas.openxmlformats.org/drawingml/2006/main" noChangeAspect="1"/>
+            </wp:cNvGraphicFramePr>
+            <a:graphic xmlns:a="http://schemas.openxmlformats.org/drawingml/2006/main">
+              <a:graphicData uri="http://schemas.openxmlformats.org/drawingml/2006/picture">
+                <pic:pic xmlns:pic="http://schemas.openxmlformats.org/drawingml/2006/picture">
+                  <pic:nvPicPr>
+                    <pic:cNvPr id="0" name="Picture 596"/>
+                    <pic:cNvPicPr>
+                      <a:picLocks noChangeAspect="1" noChangeArrowheads="1"/>
+                    </pic:cNvPicPr>
+                  </pic:nvPicPr>
+                  <pic:blipFill>
+                    <a:blip r:embed="rId31" cstate="print">
+                      <a:extLst>
+                        <a:ext uri="{28A0092B-C50C-407E-A947-70E740481C1C}">
+                          <a14:useLocalDpi xmlns:a14="http://schemas.microsoft.com/office/drawing/2010/main" val="0"/>
+                        </a:ext>
+                      </a:extLst>
+                    </a:blip>
+                    <a:srcRect/>
+                    <a:stretch>
+                      <a:fillRect/>
+                    </a:stretch>
+                  </pic:blipFill>
+                  <pic:spPr bwMode="auto">
+                    <a:xfrm>
+                      <a:off x="0" y="0"/>
+                      <a:ext cx="180975" cy="180975"/>
+                    </a:xfrm>
+                    <a:prstGeom prst="rect">
+                      <a:avLst/>
+                    </a:prstGeom>
+                    <a:noFill/>
+                    <a:ln>
+                      <a:noFill/>
+                    </a:ln>
+                  </pic:spPr>
+                </pic:pic>
+              </a:graphicData>
+            </a:graphic>
+          </wp:inline>
+        </w:drawing>
+      </w:r>
+      <w:r>
+        <w:t>，</w:t>
+      </w:r>
+      <w:r>
+        <w:rPr>
+          <w:noProof/>
+        </w:rPr>
+        <w:drawing>
+          <wp:inline distT="0" distB="0" distL="0" distR="0" wp14:anchorId="37D15F45" wp14:editId="7640AFA2">
+            <wp:extent cx="180975" cy="180975"/>
+            <wp:effectExtent l="0" t="0" r="0" b="0"/>
+            <wp:docPr id="597" name="图片 597"/>
+            <wp:cNvGraphicFramePr>
+              <a:graphicFrameLocks xmlns:a="http://schemas.openxmlformats.org/drawingml/2006/main" noChangeAspect="1"/>
+            </wp:cNvGraphicFramePr>
+            <a:graphic xmlns:a="http://schemas.openxmlformats.org/drawingml/2006/main">
+              <a:graphicData uri="http://schemas.openxmlformats.org/drawingml/2006/picture">
+                <pic:pic xmlns:pic="http://schemas.openxmlformats.org/drawingml/2006/picture">
+                  <pic:nvPicPr>
+                    <pic:cNvPr id="0" name="Picture 597"/>
+                    <pic:cNvPicPr>
+                      <a:picLocks noChangeAspect="1" noChangeArrowheads="1"/>
+                    </pic:cNvPicPr>
+                  </pic:nvPicPr>
+                  <pic:blipFill>
+                    <a:blip r:embed="rId32" cstate="print">
+                      <a:extLst>
+                        <a:ext uri="{28A0092B-C50C-407E-A947-70E740481C1C}">
+                          <a14:useLocalDpi xmlns:a14="http://schemas.microsoft.com/office/drawing/2010/main" val="0"/>
+                        </a:ext>
+                      </a:extLst>
+                    </a:blip>
+                    <a:srcRect/>
+                    <a:stretch>
+                      <a:fillRect/>
+                    </a:stretch>
+                  </pic:blipFill>
+                  <pic:spPr bwMode="auto">
+                    <a:xfrm>
+                      <a:off x="0" y="0"/>
+                      <a:ext cx="180975" cy="180975"/>
+                    </a:xfrm>
+                    <a:prstGeom prst="rect">
+                      <a:avLst/>
+                    </a:prstGeom>
+                    <a:noFill/>
+                    <a:ln>
+                      <a:noFill/>
+                    </a:ln>
+                  </pic:spPr>
+                </pic:pic>
+              </a:graphicData>
+            </a:graphic>
+          </wp:inline>
+        </w:drawing>
+      </w:r>
+      <w:r>
+        <w:t>仍然为</w:t>
+      </w:r>
+      <w:r>
+        <w:t>3</w:t>
+      </w:r>
+      <w:r>
+        <w:t>层</w:t>
+      </w:r>
+      <w:r>
+        <w:t>MLP</w:t>
+      </w:r>
+      <w:r>
+        <w:t>。为了通过反向传播来训练</w:t>
+      </w:r>
+      <w:r>
+        <w:t>GNN</w:t>
+      </w:r>
+      <w:r>
+        <w:t>，均方误差（</w:t>
+      </w:r>
+      <w:r>
+        <w:t>MSE</w:t>
+      </w:r>
+      <w:r>
+        <w:t>）被用作损失函数：</w:t>
+      </w:r>
+    </w:p>
+    <w:p>
+      <w:pPr>
+        <w:pStyle w:val="af5"/>
+      </w:pPr>
+      <w:r>
+        <w:tab/>
+      </w:r>
+      <w:r>
+        <w:rPr>
+          <w:noProof/>
+        </w:rPr>
+        <w:drawing>
+          <wp:inline distT="0" distB="0" distL="0" distR="0" wp14:anchorId="2A9EC454" wp14:editId="27DE8257">
+            <wp:extent cx="1619250" cy="377494"/>
+            <wp:effectExtent l="0" t="0" r="0" b="3810"/>
+            <wp:docPr id="598" name="图片 598"/>
+            <wp:cNvGraphicFramePr>
+              <a:graphicFrameLocks xmlns:a="http://schemas.openxmlformats.org/drawingml/2006/main" noChangeAspect="1"/>
+            </wp:cNvGraphicFramePr>
+            <a:graphic xmlns:a="http://schemas.openxmlformats.org/drawingml/2006/main">
+              <a:graphicData uri="http://schemas.openxmlformats.org/drawingml/2006/picture">
+                <pic:pic xmlns:pic="http://schemas.openxmlformats.org/drawingml/2006/picture">
+                  <pic:nvPicPr>
+                    <pic:cNvPr id="0" name="Picture 598"/>
+                    <pic:cNvPicPr>
+                      <a:picLocks noChangeAspect="1" noChangeArrowheads="1"/>
+                    </pic:cNvPicPr>
+                  </pic:nvPicPr>
+                  <pic:blipFill>
+                    <a:blip r:embed="rId33" cstate="print">
+                      <a:extLst>
+                        <a:ext uri="{28A0092B-C50C-407E-A947-70E740481C1C}">
+                          <a14:useLocalDpi xmlns:a14="http://schemas.microsoft.com/office/drawing/2010/main" val="0"/>
+                        </a:ext>
+                      </a:extLst>
+                    </a:blip>
+                    <a:srcRect/>
+                    <a:stretch>
+                      <a:fillRect/>
+                    </a:stretch>
+                  </pic:blipFill>
+                  <pic:spPr bwMode="auto">
+                    <a:xfrm>
+                      <a:off x="0" y="0"/>
+                      <a:ext cx="1624474" cy="378712"/>
+                    </a:xfrm>
+                    <a:prstGeom prst="rect">
+                      <a:avLst/>
+                    </a:prstGeom>
+                    <a:noFill/>
+                    <a:ln>
+                      <a:noFill/>
+                    </a:ln>
+                  </pic:spPr>
+                </pic:pic>
+              </a:graphicData>
+            </a:graphic>
+          </wp:inline>
+        </w:drawing>
+      </w:r>
+      <w:r>
+        <w:tab/>
+      </w:r>
+    </w:p>
+    <w:p>
+      <w:pPr>
+        <w:rPr>
+          <w:rFonts w:hint="eastAsia"/>
+        </w:rPr>
+      </w:pPr>
     </w:p>
     <w:sectPr>
       <w:pgSz w:w="11906" w:h="16838"/>
@@ -1736,10 +2140,10 @@
           <w:position w:val="-8"/>
         </w:rPr>
         <w:object w:dxaOrig="920" w:dyaOrig="400" w14:anchorId="3EC645E3">
-          <v:shape id="_x0000_i1039" type="#_x0000_t75" style="width:45.85pt;height:20.15pt" o:ole="">
+          <v:shape id="_x0000_i1039" type="#_x0000_t75" style="width:45.95pt;height:20.35pt" o:ole="">
             <v:imagedata r:id="rId1" o:title=""/>
           </v:shape>
-          <o:OLEObject Type="Embed" ProgID="Equation.DSMT4" ShapeID="_x0000_i1039" DrawAspect="Content" ObjectID="_1852666919" r:id="rId2"/>
+          <o:OLEObject Type="Embed" ProgID="Equation.DSMT4" ShapeID="_x0000_i1039" DrawAspect="Content" ObjectID="_1852829128" r:id="rId2"/>
         </w:object>
       </w:r>
     </w:p>
@@ -2933,6 +3337,39 @@
   <w:style w:type="paragraph" w:customStyle="1" w:styleId="SourceCode">
     <w:name w:val="Source Code"/>
   </w:style>
+  <w:style w:type="paragraph" w:customStyle="1" w:styleId="af5">
+    <w:name w:val="公式"/>
+    <w:basedOn w:val="a"/>
+    <w:next w:val="a"/>
+    <w:link w:val="af6"/>
+    <w:qFormat/>
+    <w:rsid w:val="007E3B20"/>
+    <w:pPr>
+      <w:tabs>
+        <w:tab w:val="center" w:pos="4121"/>
+        <w:tab w:val="center" w:pos="8220"/>
+      </w:tabs>
+      <w:textAlignment w:val="center"/>
+    </w:pPr>
+    <w:rPr>
+      <w:rFonts w:cs="Times New Roman"/>
+      <w:sz w:val="24"/>
+      <w:szCs w:val="24"/>
+      <w14:ligatures w14:val="none"/>
+    </w:rPr>
+  </w:style>
+  <w:style w:type="character" w:customStyle="1" w:styleId="af6">
+    <w:name w:val="公式 字符"/>
+    <w:link w:val="af5"/>
+    <w:qFormat/>
+    <w:rsid w:val="007E3B20"/>
+    <w:rPr>
+      <w:rFonts w:ascii="Times New Roman" w:eastAsia="宋体" w:hAnsi="Times New Roman" w:cs="Times New Roman"/>
+      <w:sz w:val="24"/>
+      <w:szCs w:val="24"/>
+      <w14:ligatures w14:val="none"/>
+    </w:rPr>
+  </w:style>
 </w:styles>
 </file>
 

</xml_diff>